<commit_message>
No code changes detected; skipping commit.
</commit_message>
<xml_diff>
--- a/data/türkçe benchmark.docx
+++ b/data/türkçe benchmark.docx
@@ -1,6 +1,6 @@
 
 <file path=word/document.xml><?xml version="1.0" encoding="utf-8"?>
-<w:document xmlns:wpc="http://schemas.microsoft.com/office/word/2010/wordprocessingCanvas" xmlns:cx="http://schemas.microsoft.com/office/drawing/2014/chartex" xmlns:cx1="http://schemas.microsoft.com/office/drawing/2015/9/8/chartex" xmlns:cx2="http://schemas.microsoft.com/office/drawing/2015/10/21/chartex" xmlns:cx3="http://schemas.microsoft.com/office/drawing/2016/5/9/chartex" xmlns:cx4="http://schemas.microsoft.com/office/drawing/2016/5/10/chartex" xmlns:cx5="http://schemas.microsoft.com/office/drawing/2016/5/11/chartex" xmlns:cx6="http://schemas.microsoft.com/office/drawing/2016/5/12/chartex" xmlns:cx7="http://schemas.microsoft.com/office/drawing/2016/5/13/chartex" xmlns:cx8="http://schemas.microsoft.com/office/drawing/2016/5/14/chartex" xmlns:mc="http://schemas.openxmlformats.org/markup-compatibility/2006" xmlns:aink="http://schemas.microsoft.com/office/drawing/2016/ink" xmlns:am3d="http://schemas.microsoft.com/office/drawing/2017/model3d" xmlns:o="urn:schemas-microsoft-com:office:office" xmlns:oel="http://schemas.microsoft.com/office/2019/extlst" xmlns:r="http://schemas.openxmlformats.org/officeDocument/2006/relationships" xmlns:m="http://schemas.openxmlformats.org/officeDocument/2006/math" xmlns:v="urn:schemas-microsoft-com:vml" xmlns:wp14="http://schemas.microsoft.com/office/word/2010/wordprocessingDrawing" xmlns:wp="http://schemas.openxmlformats.org/drawingml/2006/wordprocessingDrawing" xmlns:w10="urn:schemas-microsoft-com:office:word" xmlns:w="http://schemas.openxmlformats.org/wordprocessingml/2006/main" xmlns:w14="http://schemas.microsoft.com/office/word/2010/wordml" xmlns:w15="http://schemas.microsoft.com/office/word/2012/wordml" xmlns:w16cex="http://schemas.microsoft.com/office/word/2018/wordml/cex" xmlns:w16cid="http://schemas.microsoft.com/office/word/2016/wordml/cid" xmlns:w16="http://schemas.microsoft.com/office/word/2018/wordml" xmlns:w16du="http://schemas.microsoft.com/office/word/2023/wordml/word16du" xmlns:w16sdtdh="http://schemas.microsoft.com/office/word/2020/wordml/sdtdatahash" xmlns:w16se="http://schemas.microsoft.com/office/word/2015/wordml/symex" xmlns:wpg="http://schemas.microsoft.com/office/word/2010/wordprocessingGroup" xmlns:wpi="http://schemas.microsoft.com/office/word/2010/wordprocessingInk" xmlns:wne="http://schemas.microsoft.com/office/word/2006/wordml" xmlns:wps="http://schemas.microsoft.com/office/word/2010/wordprocessingShape" mc:Ignorable="w14 w15 w16se w16cid w16 w16cex w16sdtdh w16du wp14">
+<w:document xmlns:wpc="http://schemas.microsoft.com/office/word/2010/wordprocessingCanvas" xmlns:cx="http://schemas.microsoft.com/office/drawing/2014/chartex" xmlns:cx1="http://schemas.microsoft.com/office/drawing/2015/9/8/chartex" xmlns:cx2="http://schemas.microsoft.com/office/drawing/2015/10/21/chartex" xmlns:cx3="http://schemas.microsoft.com/office/drawing/2016/5/9/chartex" xmlns:cx4="http://schemas.microsoft.com/office/drawing/2016/5/10/chartex" xmlns:cx5="http://schemas.microsoft.com/office/drawing/2016/5/11/chartex" xmlns:cx6="http://schemas.microsoft.com/office/drawing/2016/5/12/chartex" xmlns:cx7="http://schemas.microsoft.com/office/drawing/2016/5/13/chartex" xmlns:cx8="http://schemas.microsoft.com/office/drawing/2016/5/14/chartex" xmlns:mc="http://schemas.openxmlformats.org/markup-compatibility/2006" xmlns:aink="http://schemas.microsoft.com/office/drawing/2016/ink" xmlns:am3d="http://schemas.microsoft.com/office/drawing/2017/model3d" xmlns:o="urn:schemas-microsoft-com:office:office" xmlns:oel="http://schemas.microsoft.com/office/2019/extlst" xmlns:r="http://schemas.openxmlformats.org/officeDocument/2006/relationships" xmlns:m="http://schemas.openxmlformats.org/officeDocument/2006/math" xmlns:v="urn:schemas-microsoft-com:vml" xmlns:wp14="http://schemas.microsoft.com/office/word/2010/wordprocessingDrawing" xmlns:wp="http://schemas.openxmlformats.org/drawingml/2006/wordprocessingDrawing" xmlns:w10="urn:schemas-microsoft-com:office:word" xmlns:w="http://schemas.openxmlformats.org/wordprocessingml/2006/main" xmlns:w14="http://schemas.microsoft.com/office/word/2010/wordml" xmlns:w15="http://schemas.microsoft.com/office/word/2012/wordml" xmlns:w16cex="http://schemas.microsoft.com/office/word/2018/wordml/cex" xmlns:w16cid="http://schemas.microsoft.com/office/word/2016/wordml/cid" xmlns:w16="http://schemas.microsoft.com/office/word/2018/wordml" xmlns:w16du="http://schemas.microsoft.com/office/word/2023/wordml/word16du" xmlns:w16sdtdh="http://schemas.microsoft.com/office/word/2020/wordml/sdtdatahash" xmlns:w16sdtfl="http://schemas.microsoft.com/office/word/2024/wordml/sdtformatlock" xmlns:w16se="http://schemas.microsoft.com/office/word/2015/wordml/symex" xmlns:wpg="http://schemas.microsoft.com/office/word/2010/wordprocessingGroup" xmlns:wpi="http://schemas.microsoft.com/office/word/2010/wordprocessingInk" xmlns:wne="http://schemas.microsoft.com/office/word/2006/wordml" xmlns:wps="http://schemas.microsoft.com/office/word/2010/wordprocessingShape" mc:Ignorable="w14 w15 w16se w16cid w16 w16cex w16sdtdh w16sdtfl w16du wp14">
   <w:body>
     <w:p>
       <w:pPr>
@@ -2190,7 +2190,7 @@
           <w:lang w:eastAsia="tr-TR"/>
           <w14:ligatures w14:val="none"/>
         </w:rPr>
-        <w:t xml:space="preserve">Bir şirket, 2023 yılının ilk çeyreğinde 5 milyon TL ciro elde etti. İkinci çeyrekte ciro </w:t>
+        <w:t xml:space="preserve">Bir şirket, 2023 yılının ilk çeyreğinde 5 milyon TL ciro elde etti. İkinci çeyrekte ciro %20 oranında artarak 6 milyon TL'ye ulaştı. Üçüncü çeyrekte ise ciro, ikinci çeyreğe göre %10 oranında düştü. Şirket, dördüncü çeyrekte ise üçüncü çeyrekteki ciro miktarını %25 artırmayı başardı. Bu dönemde, şirketin giderleri her çeyrek için sırasıyla 3 milyon TL, 4 milyon TL, </w:t>
       </w:r>
       <w:proofErr w:type="gramStart"/>
       <w:r>
@@ -2200,7 +2200,7 @@
           <w:lang w:eastAsia="tr-TR"/>
           <w14:ligatures w14:val="none"/>
         </w:rPr>
-        <w:t>%20</w:t>
+        <w:t>3.5</w:t>
       </w:r>
       <w:proofErr w:type="gramEnd"/>
       <w:r>
@@ -2210,7 +2210,7 @@
           <w:lang w:eastAsia="tr-TR"/>
           <w14:ligatures w14:val="none"/>
         </w:rPr>
-        <w:t xml:space="preserve"> oranında artarak 6 milyon TL'ye ulaştı. Üçüncü çeyrekte ise ciro, ikinci çeyreğe göre </w:t>
+        <w:t xml:space="preserve"> milyon TL ve </w:t>
       </w:r>
       <w:proofErr w:type="gramStart"/>
       <w:r>
@@ -2220,7 +2220,7 @@
           <w:lang w:eastAsia="tr-TR"/>
           <w14:ligatures w14:val="none"/>
         </w:rPr>
-        <w:t>%10</w:t>
+        <w:t>3.8</w:t>
       </w:r>
       <w:proofErr w:type="gramEnd"/>
       <w:r>
@@ -2230,47 +2230,7 @@
           <w:lang w:eastAsia="tr-TR"/>
           <w14:ligatures w14:val="none"/>
         </w:rPr>
-        <w:t xml:space="preserve"> oranında düştü. Şirket, dördüncü çeyrekte ise üçüncü çeyrekteki ciro miktarını </w:t>
-      </w:r>
-      <w:proofErr w:type="gramStart"/>
-      <w:r>
-        <w:rPr>
-          <w:rFonts w:ascii="Times New Roman" w:eastAsia="Times New Roman" w:hAnsi="Times New Roman" w:cs="Times New Roman"/>
-          <w:kern w:val="0"/>
-          <w:lang w:eastAsia="tr-TR"/>
-          <w14:ligatures w14:val="none"/>
-        </w:rPr>
-        <w:t>%25</w:t>
-      </w:r>
-      <w:proofErr w:type="gramEnd"/>
-      <w:r>
-        <w:rPr>
-          <w:rFonts w:ascii="Times New Roman" w:eastAsia="Times New Roman" w:hAnsi="Times New Roman" w:cs="Times New Roman"/>
-          <w:kern w:val="0"/>
-          <w:lang w:eastAsia="tr-TR"/>
-          <w14:ligatures w14:val="none"/>
-        </w:rPr>
-        <w:t xml:space="preserve"> artırmayı başardı. Bu dönemde, şirketin giderleri her çeyrek için sırasıyla 3 milyon TL, 4 milyon TL, </w:t>
-      </w:r>
-      <w:proofErr w:type="gramStart"/>
-      <w:r>
-        <w:rPr>
-          <w:rFonts w:ascii="Times New Roman" w:eastAsia="Times New Roman" w:hAnsi="Times New Roman" w:cs="Times New Roman"/>
-          <w:kern w:val="0"/>
-          <w:lang w:eastAsia="tr-TR"/>
-          <w14:ligatures w14:val="none"/>
-        </w:rPr>
-        <w:t>3.5</w:t>
-      </w:r>
-      <w:proofErr w:type="gramEnd"/>
-      <w:r>
-        <w:rPr>
-          <w:rFonts w:ascii="Times New Roman" w:eastAsia="Times New Roman" w:hAnsi="Times New Roman" w:cs="Times New Roman"/>
-          <w:kern w:val="0"/>
-          <w:lang w:eastAsia="tr-TR"/>
-          <w14:ligatures w14:val="none"/>
-        </w:rPr>
-        <w:t xml:space="preserve"> milyon TL ve 3.8 milyon TL olarak gerçekleşti. </w:t>
+        <w:t xml:space="preserve"> milyon TL olarak gerçekleşti. </w:t>
       </w:r>
     </w:p>
     <w:p>
@@ -2541,31 +2501,7 @@
           <w:lang w:eastAsia="tr-TR"/>
           <w14:ligatures w14:val="none"/>
         </w:rPr>
-        <w:t xml:space="preserve">İkinci çeyreğe göre </w:t>
-      </w:r>
-      <w:proofErr w:type="gramStart"/>
-      <w:r>
-        <w:rPr>
-          <w:rFonts w:ascii="Times New Roman" w:eastAsia="Times New Roman" w:hAnsi="Times New Roman" w:cs="Times New Roman"/>
-          <w:kern w:val="0"/>
-          <w:sz w:val="16"/>
-          <w:szCs w:val="16"/>
-          <w:lang w:eastAsia="tr-TR"/>
-          <w14:ligatures w14:val="none"/>
-        </w:rPr>
-        <w:t>%10</w:t>
-      </w:r>
-      <w:proofErr w:type="gramEnd"/>
-      <w:r>
-        <w:rPr>
-          <w:rFonts w:ascii="Times New Roman" w:eastAsia="Times New Roman" w:hAnsi="Times New Roman" w:cs="Times New Roman"/>
-          <w:kern w:val="0"/>
-          <w:sz w:val="16"/>
-          <w:szCs w:val="16"/>
-          <w:lang w:eastAsia="tr-TR"/>
-          <w14:ligatures w14:val="none"/>
-        </w:rPr>
-        <w:t xml:space="preserve"> düştü:</w:t>
+        <w:t>İkinci çeyreğe göre %10 düştü:</w:t>
       </w:r>
     </w:p>
     <w:p>
@@ -2673,31 +2609,7 @@
           <w:lang w:eastAsia="tr-TR"/>
           <w14:ligatures w14:val="none"/>
         </w:rPr>
-        <w:t xml:space="preserve">Üçüncü çeyreğe göre </w:t>
-      </w:r>
-      <w:proofErr w:type="gramStart"/>
-      <w:r>
-        <w:rPr>
-          <w:rFonts w:ascii="Times New Roman" w:eastAsia="Times New Roman" w:hAnsi="Times New Roman" w:cs="Times New Roman"/>
-          <w:kern w:val="0"/>
-          <w:sz w:val="16"/>
-          <w:szCs w:val="16"/>
-          <w:lang w:eastAsia="tr-TR"/>
-          <w14:ligatures w14:val="none"/>
-        </w:rPr>
-        <w:t>%25</w:t>
-      </w:r>
-      <w:proofErr w:type="gramEnd"/>
-      <w:r>
-        <w:rPr>
-          <w:rFonts w:ascii="Times New Roman" w:eastAsia="Times New Roman" w:hAnsi="Times New Roman" w:cs="Times New Roman"/>
-          <w:kern w:val="0"/>
-          <w:sz w:val="16"/>
-          <w:szCs w:val="16"/>
-          <w:lang w:eastAsia="tr-TR"/>
-          <w14:ligatures w14:val="none"/>
-        </w:rPr>
-        <w:t xml:space="preserve"> arttı:</w:t>
+        <w:t>Üçüncü çeyreğe göre %25 arttı:</w:t>
       </w:r>
     </w:p>
     <w:p>
@@ -2738,7 +2650,31 @@
           <w:lang w:eastAsia="tr-TR"/>
           <w14:ligatures w14:val="none"/>
         </w:rPr>
-        <w:t xml:space="preserve"> milyon TL * 1.25 = 6.75 milyon TL</w:t>
+        <w:t xml:space="preserve"> milyon TL * 1.25 = </w:t>
+      </w:r>
+      <w:proofErr w:type="gramStart"/>
+      <w:r>
+        <w:rPr>
+          <w:rFonts w:ascii="Times New Roman" w:eastAsia="Times New Roman" w:hAnsi="Times New Roman" w:cs="Times New Roman"/>
+          <w:kern w:val="0"/>
+          <w:sz w:val="16"/>
+          <w:szCs w:val="16"/>
+          <w:lang w:eastAsia="tr-TR"/>
+          <w14:ligatures w14:val="none"/>
+        </w:rPr>
+        <w:t>6.75</w:t>
+      </w:r>
+      <w:proofErr w:type="gramEnd"/>
+      <w:r>
+        <w:rPr>
+          <w:rFonts w:ascii="Times New Roman" w:eastAsia="Times New Roman" w:hAnsi="Times New Roman" w:cs="Times New Roman"/>
+          <w:kern w:val="0"/>
+          <w:sz w:val="16"/>
+          <w:szCs w:val="16"/>
+          <w:lang w:eastAsia="tr-TR"/>
+          <w14:ligatures w14:val="none"/>
+        </w:rPr>
+        <w:t xml:space="preserve"> milyon TL</w:t>
       </w:r>
     </w:p>
     <w:p>
@@ -2943,7 +2879,7 @@
           <w:lang w:eastAsia="tr-TR"/>
           <w14:ligatures w14:val="none"/>
         </w:rPr>
-        <w:t xml:space="preserve">Net kâr: 6.75 milyon </w:t>
+        <w:t xml:space="preserve">Net kâr: </w:t>
       </w:r>
       <w:proofErr w:type="gramStart"/>
       <w:r>
@@ -2955,7 +2891,7 @@
           <w:lang w:eastAsia="tr-TR"/>
           <w14:ligatures w14:val="none"/>
         </w:rPr>
-        <w:t>TL -</w:t>
+        <w:t>6.75</w:t>
       </w:r>
       <w:proofErr w:type="gramEnd"/>
       <w:r>
@@ -2967,21 +2903,84 @@
           <w:lang w:eastAsia="tr-TR"/>
           <w14:ligatures w14:val="none"/>
         </w:rPr>
-        <w:t xml:space="preserve"> 3.8 milyon TL = </w:t>
-      </w:r>
-      <w:bookmarkStart w:id="0" w:name="_Hlk170656342"/>
-      <w:r>
-        <w:rPr>
-          <w:rFonts w:ascii="Times New Roman" w:eastAsia="Times New Roman" w:hAnsi="Times New Roman" w:cs="Times New Roman"/>
-          <w:b/>
-          <w:bCs/>
+        <w:t xml:space="preserve"> milyon </w:t>
+      </w:r>
+      <w:proofErr w:type="gramStart"/>
+      <w:r>
+        <w:rPr>
+          <w:rFonts w:ascii="Times New Roman" w:eastAsia="Times New Roman" w:hAnsi="Times New Roman" w:cs="Times New Roman"/>
           <w:kern w:val="0"/>
           <w:sz w:val="16"/>
           <w:szCs w:val="16"/>
           <w:lang w:eastAsia="tr-TR"/>
           <w14:ligatures w14:val="none"/>
         </w:rPr>
-        <w:t>2.95 milyon TL</w:t>
+        <w:t>TL -</w:t>
+      </w:r>
+      <w:proofErr w:type="gramEnd"/>
+      <w:r>
+        <w:rPr>
+          <w:rFonts w:ascii="Times New Roman" w:eastAsia="Times New Roman" w:hAnsi="Times New Roman" w:cs="Times New Roman"/>
+          <w:kern w:val="0"/>
+          <w:sz w:val="16"/>
+          <w:szCs w:val="16"/>
+          <w:lang w:eastAsia="tr-TR"/>
+          <w14:ligatures w14:val="none"/>
+        </w:rPr>
+        <w:t xml:space="preserve"> </w:t>
+      </w:r>
+      <w:proofErr w:type="gramStart"/>
+      <w:r>
+        <w:rPr>
+          <w:rFonts w:ascii="Times New Roman" w:eastAsia="Times New Roman" w:hAnsi="Times New Roman" w:cs="Times New Roman"/>
+          <w:kern w:val="0"/>
+          <w:sz w:val="16"/>
+          <w:szCs w:val="16"/>
+          <w:lang w:eastAsia="tr-TR"/>
+          <w14:ligatures w14:val="none"/>
+        </w:rPr>
+        <w:t>3.8</w:t>
+      </w:r>
+      <w:proofErr w:type="gramEnd"/>
+      <w:r>
+        <w:rPr>
+          <w:rFonts w:ascii="Times New Roman" w:eastAsia="Times New Roman" w:hAnsi="Times New Roman" w:cs="Times New Roman"/>
+          <w:kern w:val="0"/>
+          <w:sz w:val="16"/>
+          <w:szCs w:val="16"/>
+          <w:lang w:eastAsia="tr-TR"/>
+          <w14:ligatures w14:val="none"/>
+        </w:rPr>
+        <w:t xml:space="preserve"> milyon TL = </w:t>
+      </w:r>
+      <w:bookmarkStart w:id="0" w:name="_Hlk170656342"/>
+      <w:proofErr w:type="gramStart"/>
+      <w:r>
+        <w:rPr>
+          <w:rFonts w:ascii="Times New Roman" w:eastAsia="Times New Roman" w:hAnsi="Times New Roman" w:cs="Times New Roman"/>
+          <w:b/>
+          <w:bCs/>
+          <w:kern w:val="0"/>
+          <w:sz w:val="16"/>
+          <w:szCs w:val="16"/>
+          <w:lang w:eastAsia="tr-TR"/>
+          <w14:ligatures w14:val="none"/>
+        </w:rPr>
+        <w:t>2.95</w:t>
+      </w:r>
+      <w:proofErr w:type="gramEnd"/>
+      <w:r>
+        <w:rPr>
+          <w:rFonts w:ascii="Times New Roman" w:eastAsia="Times New Roman" w:hAnsi="Times New Roman" w:cs="Times New Roman"/>
+          <w:b/>
+          <w:bCs/>
+          <w:kern w:val="0"/>
+          <w:sz w:val="16"/>
+          <w:szCs w:val="16"/>
+          <w:lang w:eastAsia="tr-TR"/>
+          <w14:ligatures w14:val="none"/>
+        </w:rPr>
+        <w:t xml:space="preserve"> milyon TL</w:t>
       </w:r>
       <w:bookmarkEnd w:id="0"/>
     </w:p>
@@ -3001,55 +3000,31 @@
         <w:pStyle w:val="NormalWeb"/>
       </w:pPr>
       <w:r>
-        <w:t xml:space="preserve">Bir şirket, 2023 yılının ilk çeyreğinde 5 milyon TL ciro elde etti. İkinci çeyrekte ciro </w:t>
+        <w:t xml:space="preserve">Bir şirket, 2023 yılının ilk çeyreğinde 5 milyon TL ciro elde etti. İkinci çeyrekte ciro %20 oranında artarak 6 milyon TL'ye ulaştı. Üçüncü çeyrekte ise ciro, ikinci çeyreğe göre %10 oranında düştü. Şirket, dördüncü çeyrekte ise üçüncü çeyrekteki ciro miktarını %25 artırmayı başardı. Şirketin giderleri her çeyrek için sırasıyla 3 milyon TL, 4 milyon TL, </w:t>
       </w:r>
       <w:proofErr w:type="gramStart"/>
       <w:r>
-        <w:t>%20</w:t>
+        <w:t>3.5</w:t>
       </w:r>
       <w:proofErr w:type="gramEnd"/>
       <w:r>
-        <w:t xml:space="preserve"> oranında artarak 6 milyon TL'ye ulaştı. Üçüncü çeyrekte ise ciro, ikinci çeyreğe göre </w:t>
+        <w:t xml:space="preserve"> milyon TL ve </w:t>
       </w:r>
       <w:proofErr w:type="gramStart"/>
       <w:r>
-        <w:t>%10</w:t>
+        <w:t>3.8</w:t>
       </w:r>
       <w:proofErr w:type="gramEnd"/>
       <w:r>
-        <w:t xml:space="preserve"> oranında düştü. Şirket, dördüncü çeyrekte ise üçüncü çeyrekteki ciro miktarını </w:t>
+        <w:t xml:space="preserve"> milyon TL olarak gerçekleşti. Ayrıca, şirketin yıllık amortisman gideri </w:t>
       </w:r>
       <w:proofErr w:type="gramStart"/>
       <w:r>
-        <w:t>%25</w:t>
+        <w:t>1.2</w:t>
       </w:r>
       <w:proofErr w:type="gramEnd"/>
       <w:r>
-        <w:t xml:space="preserve"> artırmayı başardı. Şirketin giderleri her çeyrek için sırasıyla 3 milyon TL, 4 milyon TL, </w:t>
-      </w:r>
-      <w:proofErr w:type="gramStart"/>
-      <w:r>
-        <w:t>3.5</w:t>
-      </w:r>
-      <w:proofErr w:type="gramEnd"/>
-      <w:r>
-        <w:t xml:space="preserve"> milyon TL ve 3.8 milyon TL olarak gerçekleşti. Ayrıca, şirketin yıllık amortisman gideri </w:t>
-      </w:r>
-      <w:proofErr w:type="gramStart"/>
-      <w:r>
-        <w:t>1.2</w:t>
-      </w:r>
-      <w:proofErr w:type="gramEnd"/>
-      <w:r>
-        <w:t xml:space="preserve"> milyon TL olup bu tutar her çeyrek için eşit olarak dağıtılmıştır. Şirket, her çeyrekte cirosunun </w:t>
-      </w:r>
-      <w:proofErr w:type="gramStart"/>
-      <w:r>
-        <w:t>%5</w:t>
-      </w:r>
-      <w:proofErr w:type="gramEnd"/>
-      <w:r>
-        <w:t>'i kadar vergi ödemektedir.</w:t>
+        <w:t xml:space="preserve"> milyon TL olup bu tutar her çeyrek için eşit olarak dağıtılmıştır. Şirket, her çeyrekte cirosunun %5'i kadar vergi ödemektedir.</w:t>
       </w:r>
     </w:p>
     <w:p>
@@ -3339,7 +3314,31 @@
           <w:lang w:eastAsia="tr-TR"/>
           <w14:ligatures w14:val="none"/>
         </w:rPr>
-        <w:t xml:space="preserve"> milyon TL * 1.25 = 6.75 milyon TL</w:t>
+        <w:t xml:space="preserve"> milyon TL * 1.25 = </w:t>
+      </w:r>
+      <w:proofErr w:type="gramStart"/>
+      <w:r>
+        <w:rPr>
+          <w:rFonts w:ascii="Times New Roman" w:eastAsia="Times New Roman" w:hAnsi="Times New Roman" w:cs="Times New Roman"/>
+          <w:kern w:val="0"/>
+          <w:sz w:val="16"/>
+          <w:szCs w:val="16"/>
+          <w:lang w:eastAsia="tr-TR"/>
+          <w14:ligatures w14:val="none"/>
+        </w:rPr>
+        <w:t>6.75</w:t>
+      </w:r>
+      <w:proofErr w:type="gramEnd"/>
+      <w:r>
+        <w:rPr>
+          <w:rFonts w:ascii="Times New Roman" w:eastAsia="Times New Roman" w:hAnsi="Times New Roman" w:cs="Times New Roman"/>
+          <w:kern w:val="0"/>
+          <w:sz w:val="16"/>
+          <w:szCs w:val="16"/>
+          <w:lang w:eastAsia="tr-TR"/>
+          <w14:ligatures w14:val="none"/>
+        </w:rPr>
+        <w:t xml:space="preserve"> milyon TL</w:t>
       </w:r>
     </w:p>
     <w:p>
@@ -3663,7 +3662,55 @@
           <w:lang w:eastAsia="tr-TR"/>
           <w14:ligatures w14:val="none"/>
         </w:rPr>
-        <w:t xml:space="preserve"> milyon TL olduğu için her çeyrek için amortisman gideri: 1.2 milyon TL / 4 = 0.3 milyon TL</w:t>
+        <w:t xml:space="preserve"> milyon TL olduğu için her çeyrek için amortisman gideri: </w:t>
+      </w:r>
+      <w:proofErr w:type="gramStart"/>
+      <w:r>
+        <w:rPr>
+          <w:rFonts w:ascii="Times New Roman" w:eastAsia="Times New Roman" w:hAnsi="Times New Roman" w:cs="Times New Roman"/>
+          <w:kern w:val="0"/>
+          <w:sz w:val="16"/>
+          <w:szCs w:val="16"/>
+          <w:lang w:eastAsia="tr-TR"/>
+          <w14:ligatures w14:val="none"/>
+        </w:rPr>
+        <w:t>1.2</w:t>
+      </w:r>
+      <w:proofErr w:type="gramEnd"/>
+      <w:r>
+        <w:rPr>
+          <w:rFonts w:ascii="Times New Roman" w:eastAsia="Times New Roman" w:hAnsi="Times New Roman" w:cs="Times New Roman"/>
+          <w:kern w:val="0"/>
+          <w:sz w:val="16"/>
+          <w:szCs w:val="16"/>
+          <w:lang w:eastAsia="tr-TR"/>
+          <w14:ligatures w14:val="none"/>
+        </w:rPr>
+        <w:t xml:space="preserve"> milyon TL / 4 = </w:t>
+      </w:r>
+      <w:proofErr w:type="gramStart"/>
+      <w:r>
+        <w:rPr>
+          <w:rFonts w:ascii="Times New Roman" w:eastAsia="Times New Roman" w:hAnsi="Times New Roman" w:cs="Times New Roman"/>
+          <w:kern w:val="0"/>
+          <w:sz w:val="16"/>
+          <w:szCs w:val="16"/>
+          <w:lang w:eastAsia="tr-TR"/>
+          <w14:ligatures w14:val="none"/>
+        </w:rPr>
+        <w:t>0.3</w:t>
+      </w:r>
+      <w:proofErr w:type="gramEnd"/>
+      <w:r>
+        <w:rPr>
+          <w:rFonts w:ascii="Times New Roman" w:eastAsia="Times New Roman" w:hAnsi="Times New Roman" w:cs="Times New Roman"/>
+          <w:kern w:val="0"/>
+          <w:sz w:val="16"/>
+          <w:szCs w:val="16"/>
+          <w:lang w:eastAsia="tr-TR"/>
+          <w14:ligatures w14:val="none"/>
+        </w:rPr>
+        <w:t xml:space="preserve"> milyon TL</w:t>
       </w:r>
     </w:p>
     <w:p>
@@ -3721,31 +3768,7 @@
           <w:lang w:eastAsia="tr-TR"/>
           <w14:ligatures w14:val="none"/>
         </w:rPr>
-        <w:t xml:space="preserve">Vergi ödemesi her çeyrek için cironun </w:t>
-      </w:r>
-      <w:proofErr w:type="gramStart"/>
-      <w:r>
-        <w:rPr>
-          <w:rFonts w:ascii="Times New Roman" w:eastAsia="Times New Roman" w:hAnsi="Times New Roman" w:cs="Times New Roman"/>
-          <w:kern w:val="0"/>
-          <w:sz w:val="16"/>
-          <w:szCs w:val="16"/>
-          <w:lang w:eastAsia="tr-TR"/>
-          <w14:ligatures w14:val="none"/>
-        </w:rPr>
-        <w:t>%5</w:t>
-      </w:r>
-      <w:proofErr w:type="gramEnd"/>
-      <w:r>
-        <w:rPr>
-          <w:rFonts w:ascii="Times New Roman" w:eastAsia="Times New Roman" w:hAnsi="Times New Roman" w:cs="Times New Roman"/>
-          <w:kern w:val="0"/>
-          <w:sz w:val="16"/>
-          <w:szCs w:val="16"/>
-          <w:lang w:eastAsia="tr-TR"/>
-          <w14:ligatures w14:val="none"/>
-        </w:rPr>
-        <w:t>'i kadardır.</w:t>
+        <w:t>Vergi ödemesi her çeyrek için cironun %5'i kadardır.</w:t>
       </w:r>
     </w:p>
     <w:p>
@@ -4215,7 +4238,247 @@
           <w:lang w:eastAsia="tr-TR"/>
           <w14:ligatures w14:val="none"/>
         </w:rPr>
-        <w:t xml:space="preserve"> Giderler - Amortisman Gideri - Vergi = 6.75 milyon TL - 3.8 milyon TL - 0.3 milyon TL - 0.3375 milyon TL = 6.75 milyon TL - 4.4375 milyon TL = 2.3125 milyon TL</w:t>
+        <w:t xml:space="preserve"> </w:t>
+      </w:r>
+      <w:proofErr w:type="gramStart"/>
+      <w:r>
+        <w:rPr>
+          <w:rFonts w:ascii="Times New Roman" w:eastAsia="Times New Roman" w:hAnsi="Times New Roman" w:cs="Times New Roman"/>
+          <w:kern w:val="0"/>
+          <w:sz w:val="16"/>
+          <w:szCs w:val="16"/>
+          <w:lang w:eastAsia="tr-TR"/>
+          <w14:ligatures w14:val="none"/>
+        </w:rPr>
+        <w:t>Giderler -</w:t>
+      </w:r>
+      <w:proofErr w:type="gramEnd"/>
+      <w:r>
+        <w:rPr>
+          <w:rFonts w:ascii="Times New Roman" w:eastAsia="Times New Roman" w:hAnsi="Times New Roman" w:cs="Times New Roman"/>
+          <w:kern w:val="0"/>
+          <w:sz w:val="16"/>
+          <w:szCs w:val="16"/>
+          <w:lang w:eastAsia="tr-TR"/>
+          <w14:ligatures w14:val="none"/>
+        </w:rPr>
+        <w:t xml:space="preserve"> Amortisman </w:t>
+      </w:r>
+      <w:proofErr w:type="gramStart"/>
+      <w:r>
+        <w:rPr>
+          <w:rFonts w:ascii="Times New Roman" w:eastAsia="Times New Roman" w:hAnsi="Times New Roman" w:cs="Times New Roman"/>
+          <w:kern w:val="0"/>
+          <w:sz w:val="16"/>
+          <w:szCs w:val="16"/>
+          <w:lang w:eastAsia="tr-TR"/>
+          <w14:ligatures w14:val="none"/>
+        </w:rPr>
+        <w:t>Gideri -</w:t>
+      </w:r>
+      <w:proofErr w:type="gramEnd"/>
+      <w:r>
+        <w:rPr>
+          <w:rFonts w:ascii="Times New Roman" w:eastAsia="Times New Roman" w:hAnsi="Times New Roman" w:cs="Times New Roman"/>
+          <w:kern w:val="0"/>
+          <w:sz w:val="16"/>
+          <w:szCs w:val="16"/>
+          <w:lang w:eastAsia="tr-TR"/>
+          <w14:ligatures w14:val="none"/>
+        </w:rPr>
+        <w:t xml:space="preserve"> Vergi = </w:t>
+      </w:r>
+      <w:proofErr w:type="gramStart"/>
+      <w:r>
+        <w:rPr>
+          <w:rFonts w:ascii="Times New Roman" w:eastAsia="Times New Roman" w:hAnsi="Times New Roman" w:cs="Times New Roman"/>
+          <w:kern w:val="0"/>
+          <w:sz w:val="16"/>
+          <w:szCs w:val="16"/>
+          <w:lang w:eastAsia="tr-TR"/>
+          <w14:ligatures w14:val="none"/>
+        </w:rPr>
+        <w:t>6.75</w:t>
+      </w:r>
+      <w:proofErr w:type="gramEnd"/>
+      <w:r>
+        <w:rPr>
+          <w:rFonts w:ascii="Times New Roman" w:eastAsia="Times New Roman" w:hAnsi="Times New Roman" w:cs="Times New Roman"/>
+          <w:kern w:val="0"/>
+          <w:sz w:val="16"/>
+          <w:szCs w:val="16"/>
+          <w:lang w:eastAsia="tr-TR"/>
+          <w14:ligatures w14:val="none"/>
+        </w:rPr>
+        <w:t xml:space="preserve"> milyon </w:t>
+      </w:r>
+      <w:proofErr w:type="gramStart"/>
+      <w:r>
+        <w:rPr>
+          <w:rFonts w:ascii="Times New Roman" w:eastAsia="Times New Roman" w:hAnsi="Times New Roman" w:cs="Times New Roman"/>
+          <w:kern w:val="0"/>
+          <w:sz w:val="16"/>
+          <w:szCs w:val="16"/>
+          <w:lang w:eastAsia="tr-TR"/>
+          <w14:ligatures w14:val="none"/>
+        </w:rPr>
+        <w:t>TL -</w:t>
+      </w:r>
+      <w:proofErr w:type="gramEnd"/>
+      <w:r>
+        <w:rPr>
+          <w:rFonts w:ascii="Times New Roman" w:eastAsia="Times New Roman" w:hAnsi="Times New Roman" w:cs="Times New Roman"/>
+          <w:kern w:val="0"/>
+          <w:sz w:val="16"/>
+          <w:szCs w:val="16"/>
+          <w:lang w:eastAsia="tr-TR"/>
+          <w14:ligatures w14:val="none"/>
+        </w:rPr>
+        <w:t xml:space="preserve"> </w:t>
+      </w:r>
+      <w:proofErr w:type="gramStart"/>
+      <w:r>
+        <w:rPr>
+          <w:rFonts w:ascii="Times New Roman" w:eastAsia="Times New Roman" w:hAnsi="Times New Roman" w:cs="Times New Roman"/>
+          <w:kern w:val="0"/>
+          <w:sz w:val="16"/>
+          <w:szCs w:val="16"/>
+          <w:lang w:eastAsia="tr-TR"/>
+          <w14:ligatures w14:val="none"/>
+        </w:rPr>
+        <w:t>3.8</w:t>
+      </w:r>
+      <w:proofErr w:type="gramEnd"/>
+      <w:r>
+        <w:rPr>
+          <w:rFonts w:ascii="Times New Roman" w:eastAsia="Times New Roman" w:hAnsi="Times New Roman" w:cs="Times New Roman"/>
+          <w:kern w:val="0"/>
+          <w:sz w:val="16"/>
+          <w:szCs w:val="16"/>
+          <w:lang w:eastAsia="tr-TR"/>
+          <w14:ligatures w14:val="none"/>
+        </w:rPr>
+        <w:t xml:space="preserve"> milyon </w:t>
+      </w:r>
+      <w:proofErr w:type="gramStart"/>
+      <w:r>
+        <w:rPr>
+          <w:rFonts w:ascii="Times New Roman" w:eastAsia="Times New Roman" w:hAnsi="Times New Roman" w:cs="Times New Roman"/>
+          <w:kern w:val="0"/>
+          <w:sz w:val="16"/>
+          <w:szCs w:val="16"/>
+          <w:lang w:eastAsia="tr-TR"/>
+          <w14:ligatures w14:val="none"/>
+        </w:rPr>
+        <w:t>TL -</w:t>
+      </w:r>
+      <w:proofErr w:type="gramEnd"/>
+      <w:r>
+        <w:rPr>
+          <w:rFonts w:ascii="Times New Roman" w:eastAsia="Times New Roman" w:hAnsi="Times New Roman" w:cs="Times New Roman"/>
+          <w:kern w:val="0"/>
+          <w:sz w:val="16"/>
+          <w:szCs w:val="16"/>
+          <w:lang w:eastAsia="tr-TR"/>
+          <w14:ligatures w14:val="none"/>
+        </w:rPr>
+        <w:t xml:space="preserve"> </w:t>
+      </w:r>
+      <w:proofErr w:type="gramStart"/>
+      <w:r>
+        <w:rPr>
+          <w:rFonts w:ascii="Times New Roman" w:eastAsia="Times New Roman" w:hAnsi="Times New Roman" w:cs="Times New Roman"/>
+          <w:kern w:val="0"/>
+          <w:sz w:val="16"/>
+          <w:szCs w:val="16"/>
+          <w:lang w:eastAsia="tr-TR"/>
+          <w14:ligatures w14:val="none"/>
+        </w:rPr>
+        <w:t>0.3</w:t>
+      </w:r>
+      <w:proofErr w:type="gramEnd"/>
+      <w:r>
+        <w:rPr>
+          <w:rFonts w:ascii="Times New Roman" w:eastAsia="Times New Roman" w:hAnsi="Times New Roman" w:cs="Times New Roman"/>
+          <w:kern w:val="0"/>
+          <w:sz w:val="16"/>
+          <w:szCs w:val="16"/>
+          <w:lang w:eastAsia="tr-TR"/>
+          <w14:ligatures w14:val="none"/>
+        </w:rPr>
+        <w:t xml:space="preserve"> milyon </w:t>
+      </w:r>
+      <w:proofErr w:type="gramStart"/>
+      <w:r>
+        <w:rPr>
+          <w:rFonts w:ascii="Times New Roman" w:eastAsia="Times New Roman" w:hAnsi="Times New Roman" w:cs="Times New Roman"/>
+          <w:kern w:val="0"/>
+          <w:sz w:val="16"/>
+          <w:szCs w:val="16"/>
+          <w:lang w:eastAsia="tr-TR"/>
+          <w14:ligatures w14:val="none"/>
+        </w:rPr>
+        <w:t>TL -</w:t>
+      </w:r>
+      <w:proofErr w:type="gramEnd"/>
+      <w:r>
+        <w:rPr>
+          <w:rFonts w:ascii="Times New Roman" w:eastAsia="Times New Roman" w:hAnsi="Times New Roman" w:cs="Times New Roman"/>
+          <w:kern w:val="0"/>
+          <w:sz w:val="16"/>
+          <w:szCs w:val="16"/>
+          <w:lang w:eastAsia="tr-TR"/>
+          <w14:ligatures w14:val="none"/>
+        </w:rPr>
+        <w:t xml:space="preserve"> 0.3375 milyon TL = </w:t>
+      </w:r>
+      <w:proofErr w:type="gramStart"/>
+      <w:r>
+        <w:rPr>
+          <w:rFonts w:ascii="Times New Roman" w:eastAsia="Times New Roman" w:hAnsi="Times New Roman" w:cs="Times New Roman"/>
+          <w:kern w:val="0"/>
+          <w:sz w:val="16"/>
+          <w:szCs w:val="16"/>
+          <w:lang w:eastAsia="tr-TR"/>
+          <w14:ligatures w14:val="none"/>
+        </w:rPr>
+        <w:t>6.75</w:t>
+      </w:r>
+      <w:proofErr w:type="gramEnd"/>
+      <w:r>
+        <w:rPr>
+          <w:rFonts w:ascii="Times New Roman" w:eastAsia="Times New Roman" w:hAnsi="Times New Roman" w:cs="Times New Roman"/>
+          <w:kern w:val="0"/>
+          <w:sz w:val="16"/>
+          <w:szCs w:val="16"/>
+          <w:lang w:eastAsia="tr-TR"/>
+          <w14:ligatures w14:val="none"/>
+        </w:rPr>
+        <w:t xml:space="preserve"> milyon </w:t>
+      </w:r>
+      <w:proofErr w:type="gramStart"/>
+      <w:r>
+        <w:rPr>
+          <w:rFonts w:ascii="Times New Roman" w:eastAsia="Times New Roman" w:hAnsi="Times New Roman" w:cs="Times New Roman"/>
+          <w:kern w:val="0"/>
+          <w:sz w:val="16"/>
+          <w:szCs w:val="16"/>
+          <w:lang w:eastAsia="tr-TR"/>
+          <w14:ligatures w14:val="none"/>
+        </w:rPr>
+        <w:t>TL -</w:t>
+      </w:r>
+      <w:proofErr w:type="gramEnd"/>
+      <w:r>
+        <w:rPr>
+          <w:rFonts w:ascii="Times New Roman" w:eastAsia="Times New Roman" w:hAnsi="Times New Roman" w:cs="Times New Roman"/>
+          <w:kern w:val="0"/>
+          <w:sz w:val="16"/>
+          <w:szCs w:val="16"/>
+          <w:lang w:eastAsia="tr-TR"/>
+          <w14:ligatures w14:val="none"/>
+        </w:rPr>
+        <w:t xml:space="preserve"> 4.4375 milyon TL = 2.3125 milyon TL</w:t>
       </w:r>
     </w:p>
     <w:p>
@@ -6236,31 +6499,17 @@
           <w14:ligatures w14:val="none"/>
         </w:rPr>
       </w:pPr>
-      <w:proofErr w:type="gramStart"/>
-      <w:r>
-        <w:rPr>
-          <w:rFonts w:ascii="Arial" w:eastAsia="Times New Roman" w:hAnsi="Arial" w:cs="Arial"/>
-          <w:b/>
-          <w:bCs/>
-          <w:color w:val="484848"/>
-          <w:kern w:val="0"/>
-          <w:lang w:eastAsia="tr-TR"/>
-          <w14:ligatures w14:val="none"/>
-        </w:rPr>
-        <w:t>½</w:t>
-      </w:r>
-      <w:proofErr w:type="gramEnd"/>
-      <w:r>
-        <w:rPr>
-          <w:rFonts w:ascii="Arial" w:eastAsia="Times New Roman" w:hAnsi="Arial" w:cs="Arial"/>
-          <w:b/>
-          <w:bCs/>
-          <w:color w:val="484848"/>
-          <w:kern w:val="0"/>
-          <w:lang w:eastAsia="tr-TR"/>
-          <w14:ligatures w14:val="none"/>
-        </w:rPr>
-        <w:t xml:space="preserve"> </w:t>
+      <w:r>
+        <w:rPr>
+          <w:rFonts w:ascii="Arial" w:eastAsia="Times New Roman" w:hAnsi="Arial" w:cs="Arial"/>
+          <w:b/>
+          <w:bCs/>
+          <w:color w:val="484848"/>
+          <w:kern w:val="0"/>
+          <w:lang w:eastAsia="tr-TR"/>
+          <w14:ligatures w14:val="none"/>
+        </w:rPr>
+        <w:t xml:space="preserve">½ </w:t>
       </w:r>
       <w:r>
         <w:rPr>
@@ -7675,31 +7924,17 @@
           <w14:ligatures w14:val="none"/>
         </w:rPr>
       </w:pPr>
-      <w:proofErr w:type="gramStart"/>
-      <w:r>
-        <w:rPr>
-          <w:rFonts w:ascii="Arial" w:eastAsia="Times New Roman" w:hAnsi="Arial" w:cs="Arial"/>
-          <w:b/>
-          <w:bCs/>
-          <w:color w:val="484848"/>
-          <w:kern w:val="0"/>
-          <w:lang w:eastAsia="tr-TR"/>
-          <w14:ligatures w14:val="none"/>
-        </w:rPr>
-        <w:t>½</w:t>
-      </w:r>
-      <w:proofErr w:type="gramEnd"/>
-      <w:r>
-        <w:rPr>
-          <w:rFonts w:ascii="Arial" w:eastAsia="Times New Roman" w:hAnsi="Arial" w:cs="Arial"/>
-          <w:b/>
-          <w:bCs/>
-          <w:color w:val="484848"/>
-          <w:kern w:val="0"/>
-          <w:lang w:eastAsia="tr-TR"/>
-          <w14:ligatures w14:val="none"/>
-        </w:rPr>
-        <w:t xml:space="preserve"> </w:t>
+      <w:r>
+        <w:rPr>
+          <w:rFonts w:ascii="Arial" w:eastAsia="Times New Roman" w:hAnsi="Arial" w:cs="Arial"/>
+          <w:b/>
+          <w:bCs/>
+          <w:color w:val="484848"/>
+          <w:kern w:val="0"/>
+          <w:lang w:eastAsia="tr-TR"/>
+          <w14:ligatures w14:val="none"/>
+        </w:rPr>
+        <w:t xml:space="preserve">½ </w:t>
       </w:r>
       <w:r>
         <w:rPr>
@@ -9121,31 +9356,17 @@
           <w14:ligatures w14:val="none"/>
         </w:rPr>
       </w:pPr>
-      <w:proofErr w:type="gramStart"/>
-      <w:r>
-        <w:rPr>
-          <w:rFonts w:ascii="Arial" w:eastAsia="Times New Roman" w:hAnsi="Arial" w:cs="Arial"/>
-          <w:b/>
-          <w:bCs/>
-          <w:color w:val="484848"/>
-          <w:kern w:val="0"/>
-          <w:lang w:eastAsia="tr-TR"/>
-          <w14:ligatures w14:val="none"/>
-        </w:rPr>
-        <w:t>½</w:t>
-      </w:r>
-      <w:proofErr w:type="gramEnd"/>
-      <w:r>
-        <w:rPr>
-          <w:rFonts w:ascii="Arial" w:eastAsia="Times New Roman" w:hAnsi="Arial" w:cs="Arial"/>
-          <w:b/>
-          <w:bCs/>
-          <w:color w:val="484848"/>
-          <w:kern w:val="0"/>
-          <w:lang w:eastAsia="tr-TR"/>
-          <w14:ligatures w14:val="none"/>
-        </w:rPr>
-        <w:t xml:space="preserve"> </w:t>
+      <w:r>
+        <w:rPr>
+          <w:rFonts w:ascii="Arial" w:eastAsia="Times New Roman" w:hAnsi="Arial" w:cs="Arial"/>
+          <w:b/>
+          <w:bCs/>
+          <w:color w:val="484848"/>
+          <w:kern w:val="0"/>
+          <w:lang w:eastAsia="tr-TR"/>
+          <w14:ligatures w14:val="none"/>
+        </w:rPr>
+        <w:t xml:space="preserve">½ </w:t>
       </w:r>
       <w:r>
         <w:rPr>
@@ -10568,31 +10789,17 @@
           <w14:ligatures w14:val="none"/>
         </w:rPr>
       </w:pPr>
-      <w:proofErr w:type="gramStart"/>
-      <w:r>
-        <w:rPr>
-          <w:rFonts w:ascii="Arial" w:eastAsia="Times New Roman" w:hAnsi="Arial" w:cs="Arial"/>
-          <w:b/>
-          <w:bCs/>
-          <w:color w:val="484848"/>
-          <w:kern w:val="0"/>
-          <w:lang w:eastAsia="tr-TR"/>
-          <w14:ligatures w14:val="none"/>
-        </w:rPr>
-        <w:t>½</w:t>
-      </w:r>
-      <w:proofErr w:type="gramEnd"/>
-      <w:r>
-        <w:rPr>
-          <w:rFonts w:ascii="Arial" w:eastAsia="Times New Roman" w:hAnsi="Arial" w:cs="Arial"/>
-          <w:b/>
-          <w:bCs/>
-          <w:color w:val="484848"/>
-          <w:kern w:val="0"/>
-          <w:lang w:eastAsia="tr-TR"/>
-          <w14:ligatures w14:val="none"/>
-        </w:rPr>
-        <w:t xml:space="preserve"> </w:t>
+      <w:r>
+        <w:rPr>
+          <w:rFonts w:ascii="Arial" w:eastAsia="Times New Roman" w:hAnsi="Arial" w:cs="Arial"/>
+          <w:b/>
+          <w:bCs/>
+          <w:color w:val="484848"/>
+          <w:kern w:val="0"/>
+          <w:lang w:eastAsia="tr-TR"/>
+          <w14:ligatures w14:val="none"/>
+        </w:rPr>
+        <w:t xml:space="preserve">½ </w:t>
       </w:r>
       <w:r>
         <w:rPr>
@@ -11438,7 +11645,7 @@
 </file>
 
 <file path=word/numbering.xml><?xml version="1.0" encoding="utf-8"?>
-<w:numbering xmlns:wpc="http://schemas.microsoft.com/office/word/2010/wordprocessingCanvas" xmlns:cx="http://schemas.microsoft.com/office/drawing/2014/chartex" xmlns:cx1="http://schemas.microsoft.com/office/drawing/2015/9/8/chartex" xmlns:cx2="http://schemas.microsoft.com/office/drawing/2015/10/21/chartex" xmlns:cx3="http://schemas.microsoft.com/office/drawing/2016/5/9/chartex" xmlns:cx4="http://schemas.microsoft.com/office/drawing/2016/5/10/chartex" xmlns:cx5="http://schemas.microsoft.com/office/drawing/2016/5/11/chartex" xmlns:cx6="http://schemas.microsoft.com/office/drawing/2016/5/12/chartex" xmlns:cx7="http://schemas.microsoft.com/office/drawing/2016/5/13/chartex" xmlns:cx8="http://schemas.microsoft.com/office/drawing/2016/5/14/chartex" xmlns:mc="http://schemas.openxmlformats.org/markup-compatibility/2006" xmlns:aink="http://schemas.microsoft.com/office/drawing/2016/ink" xmlns:am3d="http://schemas.microsoft.com/office/drawing/2017/model3d" xmlns:o="urn:schemas-microsoft-com:office:office" xmlns:oel="http://schemas.microsoft.com/office/2019/extlst" xmlns:r="http://schemas.openxmlformats.org/officeDocument/2006/relationships" xmlns:m="http://schemas.openxmlformats.org/officeDocument/2006/math" xmlns:v="urn:schemas-microsoft-com:vml" xmlns:wp14="http://schemas.microsoft.com/office/word/2010/wordprocessingDrawing" xmlns:wp="http://schemas.openxmlformats.org/drawingml/2006/wordprocessingDrawing" xmlns:w10="urn:schemas-microsoft-com:office:word" xmlns:w="http://schemas.openxmlformats.org/wordprocessingml/2006/main" xmlns:w14="http://schemas.microsoft.com/office/word/2010/wordml" xmlns:w15="http://schemas.microsoft.com/office/word/2012/wordml" xmlns:w16cex="http://schemas.microsoft.com/office/word/2018/wordml/cex" xmlns:w16cid="http://schemas.microsoft.com/office/word/2016/wordml/cid" xmlns:w16="http://schemas.microsoft.com/office/word/2018/wordml" xmlns:w16du="http://schemas.microsoft.com/office/word/2023/wordml/word16du" xmlns:w16sdtdh="http://schemas.microsoft.com/office/word/2020/wordml/sdtdatahash" xmlns:w16se="http://schemas.microsoft.com/office/word/2015/wordml/symex" xmlns:wpg="http://schemas.microsoft.com/office/word/2010/wordprocessingGroup" xmlns:wpi="http://schemas.microsoft.com/office/word/2010/wordprocessingInk" xmlns:wne="http://schemas.microsoft.com/office/word/2006/wordml" xmlns:wps="http://schemas.microsoft.com/office/word/2010/wordprocessingShape" mc:Ignorable="w14 w15 w16se w16cid w16 w16cex w16sdtdh w16du wp14">
+<w:numbering xmlns:wpc="http://schemas.microsoft.com/office/word/2010/wordprocessingCanvas" xmlns:cx="http://schemas.microsoft.com/office/drawing/2014/chartex" xmlns:cx1="http://schemas.microsoft.com/office/drawing/2015/9/8/chartex" xmlns:cx2="http://schemas.microsoft.com/office/drawing/2015/10/21/chartex" xmlns:cx3="http://schemas.microsoft.com/office/drawing/2016/5/9/chartex" xmlns:cx4="http://schemas.microsoft.com/office/drawing/2016/5/10/chartex" xmlns:cx5="http://schemas.microsoft.com/office/drawing/2016/5/11/chartex" xmlns:cx6="http://schemas.microsoft.com/office/drawing/2016/5/12/chartex" xmlns:cx7="http://schemas.microsoft.com/office/drawing/2016/5/13/chartex" xmlns:cx8="http://schemas.microsoft.com/office/drawing/2016/5/14/chartex" xmlns:mc="http://schemas.openxmlformats.org/markup-compatibility/2006" xmlns:aink="http://schemas.microsoft.com/office/drawing/2016/ink" xmlns:am3d="http://schemas.microsoft.com/office/drawing/2017/model3d" xmlns:o="urn:schemas-microsoft-com:office:office" xmlns:oel="http://schemas.microsoft.com/office/2019/extlst" xmlns:r="http://schemas.openxmlformats.org/officeDocument/2006/relationships" xmlns:m="http://schemas.openxmlformats.org/officeDocument/2006/math" xmlns:v="urn:schemas-microsoft-com:vml" xmlns:wp14="http://schemas.microsoft.com/office/word/2010/wordprocessingDrawing" xmlns:wp="http://schemas.openxmlformats.org/drawingml/2006/wordprocessingDrawing" xmlns:w10="urn:schemas-microsoft-com:office:word" xmlns:w="http://schemas.openxmlformats.org/wordprocessingml/2006/main" xmlns:w14="http://schemas.microsoft.com/office/word/2010/wordml" xmlns:w15="http://schemas.microsoft.com/office/word/2012/wordml" xmlns:w16cex="http://schemas.microsoft.com/office/word/2018/wordml/cex" xmlns:w16cid="http://schemas.microsoft.com/office/word/2016/wordml/cid" xmlns:w16="http://schemas.microsoft.com/office/word/2018/wordml" xmlns:w16du="http://schemas.microsoft.com/office/word/2023/wordml/word16du" xmlns:w16sdtdh="http://schemas.microsoft.com/office/word/2020/wordml/sdtdatahash" xmlns:w16sdtfl="http://schemas.microsoft.com/office/word/2024/wordml/sdtformatlock" xmlns:w16se="http://schemas.microsoft.com/office/word/2015/wordml/symex" xmlns:wpg="http://schemas.microsoft.com/office/word/2010/wordprocessingGroup" xmlns:wpi="http://schemas.microsoft.com/office/word/2010/wordprocessingInk" xmlns:wne="http://schemas.microsoft.com/office/word/2006/wordml" xmlns:wps="http://schemas.microsoft.com/office/word/2010/wordprocessingShape" mc:Ignorable="w14 w15 w16se w16cid w16 w16cex w16sdtdh w16sdtfl w16du wp14">
   <w:abstractNum w:abstractNumId="0" w15:restartNumberingAfterBreak="0">
     <w:nsid w:val="021A50F8"/>
     <w:multiLevelType w:val="multilevel"/>
@@ -14259,7 +14466,7 @@
 </file>
 
 <file path=word/styles.xml><?xml version="1.0" encoding="utf-8"?>
-<w:styles xmlns:mc="http://schemas.openxmlformats.org/markup-compatibility/2006" xmlns:r="http://schemas.openxmlformats.org/officeDocument/2006/relationships" xmlns:w="http://schemas.openxmlformats.org/wordprocessingml/2006/main" xmlns:w14="http://schemas.microsoft.com/office/word/2010/wordml" xmlns:w15="http://schemas.microsoft.com/office/word/2012/wordml" xmlns:w16cex="http://schemas.microsoft.com/office/word/2018/wordml/cex" xmlns:w16cid="http://schemas.microsoft.com/office/word/2016/wordml/cid" xmlns:w16="http://schemas.microsoft.com/office/word/2018/wordml" xmlns:w16du="http://schemas.microsoft.com/office/word/2023/wordml/word16du" xmlns:w16sdtdh="http://schemas.microsoft.com/office/word/2020/wordml/sdtdatahash" xmlns:w16se="http://schemas.microsoft.com/office/word/2015/wordml/symex" mc:Ignorable="w14 w15 w16se w16cid w16 w16cex w16sdtdh w16du">
+<w:styles xmlns:mc="http://schemas.openxmlformats.org/markup-compatibility/2006" xmlns:r="http://schemas.openxmlformats.org/officeDocument/2006/relationships" xmlns:w="http://schemas.openxmlformats.org/wordprocessingml/2006/main" xmlns:w14="http://schemas.microsoft.com/office/word/2010/wordml" xmlns:w15="http://schemas.microsoft.com/office/word/2012/wordml" xmlns:w16cex="http://schemas.microsoft.com/office/word/2018/wordml/cex" xmlns:w16cid="http://schemas.microsoft.com/office/word/2016/wordml/cid" xmlns:w16="http://schemas.microsoft.com/office/word/2018/wordml" xmlns:w16du="http://schemas.microsoft.com/office/word/2023/wordml/word16du" xmlns:w16sdtdh="http://schemas.microsoft.com/office/word/2020/wordml/sdtdatahash" xmlns:w16sdtfl="http://schemas.microsoft.com/office/word/2024/wordml/sdtformatlock" xmlns:w16se="http://schemas.microsoft.com/office/word/2015/wordml/symex" mc:Ignorable="w14 w15 w16se w16cid w16 w16cex w16sdtdh w16sdtfl w16du">
   <w:docDefaults>
     <w:rPrDefault>
       <w:rPr>

</xml_diff>